<commit_message>
submit jobsheet 5 assignment
</commit_message>
<xml_diff>
--- a/06_Azaria Cindy Sahasika/Jobsheet 5/Jobsheet 5 - Azaria Cindy Sahasika.docx
+++ b/06_Azaria Cindy Sahasika/Jobsheet 5/Jobsheet 5 - Azaria Cindy Sahasika.docx
@@ -437,6 +437,7 @@
         <w:rPr>
           <w:rFonts w:ascii="Times New Roman" w:hAnsi="Times New Roman" w:cs="Times New Roman"/>
           <w:bCs/>
+          <w:noProof/>
           <w:sz w:val="24"/>
           <w:szCs w:val="24"/>
           <w:lang w:val="en-US"/>
@@ -481,6 +482,7 @@
         <w:rPr>
           <w:rFonts w:ascii="Times New Roman" w:hAnsi="Times New Roman" w:cs="Times New Roman"/>
           <w:bCs/>
+          <w:noProof/>
           <w:sz w:val="24"/>
           <w:szCs w:val="24"/>
           <w:lang w:val="en-US"/>
@@ -617,6 +619,7 @@
         <w:rPr>
           <w:rFonts w:ascii="Times New Roman" w:hAnsi="Times New Roman" w:cs="Times New Roman"/>
           <w:bCs/>
+          <w:noProof/>
           <w:sz w:val="24"/>
           <w:szCs w:val="24"/>
           <w:lang w:val="en-US"/>
@@ -887,6 +890,7 @@
         <w:rPr>
           <w:rFonts w:ascii="Times New Roman" w:hAnsi="Times New Roman" w:cs="Times New Roman"/>
           <w:bCs/>
+          <w:noProof/>
           <w:sz w:val="24"/>
           <w:szCs w:val="24"/>
           <w:lang w:val="en-US"/>
@@ -1072,6 +1076,7 @@
         <w:rPr>
           <w:rFonts w:ascii="Times New Roman" w:hAnsi="Times New Roman" w:cs="Times New Roman"/>
           <w:bCs/>
+          <w:noProof/>
           <w:sz w:val="24"/>
           <w:szCs w:val="24"/>
           <w:lang w:val="en-US"/>
@@ -1342,6 +1347,7 @@
         <w:rPr>
           <w:rFonts w:ascii="Times New Roman" w:hAnsi="Times New Roman" w:cs="Times New Roman"/>
           <w:bCs/>
+          <w:noProof/>
           <w:sz w:val="24"/>
           <w:szCs w:val="24"/>
           <w:lang w:val="en-US"/>
@@ -1561,6 +1567,7 @@
         <w:rPr>
           <w:rFonts w:ascii="Times New Roman" w:hAnsi="Times New Roman" w:cs="Times New Roman"/>
           <w:bCs/>
+          <w:noProof/>
           <w:sz w:val="24"/>
           <w:szCs w:val="24"/>
           <w:lang w:val="en-US"/>
@@ -1605,6 +1612,7 @@
         <w:rPr>
           <w:rFonts w:ascii="Times New Roman" w:hAnsi="Times New Roman" w:cs="Times New Roman"/>
           <w:bCs/>
+          <w:noProof/>
           <w:sz w:val="24"/>
           <w:szCs w:val="24"/>
           <w:lang w:val="en-US"/>
@@ -1845,6 +1853,7 @@
         <w:rPr>
           <w:rFonts w:ascii="Times New Roman" w:hAnsi="Times New Roman" w:cs="Times New Roman"/>
           <w:bCs/>
+          <w:noProof/>
           <w:sz w:val="24"/>
           <w:szCs w:val="24"/>
           <w:lang w:val="en-US"/>
@@ -2275,6 +2284,7 @@
         <w:rPr>
           <w:rFonts w:ascii="Times New Roman" w:hAnsi="Times New Roman" w:cs="Times New Roman"/>
           <w:bCs/>
+          <w:noProof/>
           <w:sz w:val="24"/>
           <w:szCs w:val="24"/>
           <w:lang w:val="en-US"/>
@@ -2330,8 +2340,6 @@
           <w:lang w:val="en-US"/>
         </w:rPr>
       </w:pPr>
-      <w:bookmarkStart w:id="0" w:name="_GoBack"/>
-      <w:bookmarkEnd w:id="0"/>
     </w:p>
     <w:p>
       <w:pPr>
@@ -2839,7 +2847,7 @@
       <w:pPr>
         <w:pStyle w:val="ListParagraph"/>
         <w:ind w:left="1080"/>
-        <w:jc w:val="both"/>
+        <w:jc w:val="center"/>
         <w:rPr>
           <w:rFonts w:ascii="Times New Roman" w:hAnsi="Times New Roman" w:cs="Times New Roman"/>
           <w:bCs/>
@@ -2857,10 +2865,10 @@
           <w:lang w:val="en-US"/>
         </w:rPr>
         <w:drawing>
-          <wp:inline distT="0" distB="0" distL="0" distR="0" wp14:anchorId="5CA9B981" wp14:editId="763E68F2">
-            <wp:extent cx="5038725" cy="2834213"/>
-            <wp:effectExtent l="0" t="0" r="0" b="4445"/>
-            <wp:docPr id="13" name="Picture 13"/>
+          <wp:inline distT="0" distB="0" distL="0" distR="0" wp14:anchorId="00EE4102" wp14:editId="0C1CD9AE">
+            <wp:extent cx="4027714" cy="2933993"/>
+            <wp:effectExtent l="0" t="0" r="0" b="0"/>
+            <wp:docPr id="6" name="Picture 6"/>
             <wp:cNvGraphicFramePr>
               <a:graphicFrameLocks xmlns:a="http://schemas.openxmlformats.org/drawingml/2006/main" noChangeAspect="1"/>
             </wp:cNvGraphicFramePr>
@@ -2880,7 +2888,7 @@
                   <pic:spPr>
                     <a:xfrm>
                       <a:off x="0" y="0"/>
-                      <a:ext cx="5051053" cy="2841148"/>
+                      <a:ext cx="4050668" cy="2950714"/>
                     </a:xfrm>
                     <a:prstGeom prst="rect">
                       <a:avLst/>
@@ -3178,7 +3186,7 @@
       <w:pPr>
         <w:pStyle w:val="ListParagraph"/>
         <w:ind w:left="1080"/>
-        <w:jc w:val="both"/>
+        <w:jc w:val="center"/>
         <w:rPr>
           <w:rFonts w:ascii="Times New Roman" w:hAnsi="Times New Roman" w:cs="Times New Roman"/>
           <w:bCs/>
@@ -3196,10 +3204,10 @@
           <w:lang w:val="en-US"/>
         </w:rPr>
         <w:drawing>
-          <wp:inline distT="0" distB="0" distL="0" distR="0" wp14:anchorId="52F412FD" wp14:editId="78896054">
-            <wp:extent cx="4991100" cy="2807425"/>
-            <wp:effectExtent l="0" t="0" r="0" b="0"/>
-            <wp:docPr id="14" name="Picture 14"/>
+          <wp:inline distT="0" distB="0" distL="0" distR="0" wp14:anchorId="7A5E73B1" wp14:editId="1FC7BD2B">
+            <wp:extent cx="4994601" cy="1328057"/>
+            <wp:effectExtent l="0" t="0" r="0" b="5715"/>
+            <wp:docPr id="12" name="Picture 12"/>
             <wp:cNvGraphicFramePr>
               <a:graphicFrameLocks xmlns:a="http://schemas.openxmlformats.org/drawingml/2006/main" noChangeAspect="1"/>
             </wp:cNvGraphicFramePr>
@@ -3219,7 +3227,7 @@
                   <pic:spPr>
                     <a:xfrm>
                       <a:off x="0" y="0"/>
-                      <a:ext cx="4999612" cy="2812213"/>
+                      <a:ext cx="5023099" cy="1335635"/>
                     </a:xfrm>
                     <a:prstGeom prst="rect">
                       <a:avLst/>
@@ -3257,7 +3265,6 @@
           <w:szCs w:val="24"/>
           <w:lang w:val="en-US"/>
         </w:rPr>
-        <w:lastRenderedPageBreak/>
         <w:t>Klik</w:t>
       </w:r>
       <w:proofErr w:type="spellEnd"/>
@@ -3401,11 +3408,12 @@
           <w:szCs w:val="24"/>
           <w:lang w:val="en-US"/>
         </w:rPr>
+        <w:lastRenderedPageBreak/>
         <w:drawing>
-          <wp:inline distT="0" distB="0" distL="0" distR="0" wp14:anchorId="2C62F42A" wp14:editId="39884AD4">
-            <wp:extent cx="2438400" cy="1865745"/>
-            <wp:effectExtent l="0" t="0" r="0" b="1270"/>
-            <wp:docPr id="15" name="Picture 15"/>
+          <wp:inline distT="0" distB="0" distL="0" distR="0" wp14:anchorId="01036CD4" wp14:editId="1D2DEF46">
+            <wp:extent cx="2547257" cy="1866641"/>
+            <wp:effectExtent l="0" t="0" r="5715" b="635"/>
+            <wp:docPr id="19" name="Picture 19"/>
             <wp:cNvGraphicFramePr>
               <a:graphicFrameLocks xmlns:a="http://schemas.openxmlformats.org/drawingml/2006/main" noChangeAspect="1"/>
             </wp:cNvGraphicFramePr>
@@ -3425,7 +3433,7 @@
                   <pic:spPr>
                     <a:xfrm>
                       <a:off x="0" y="0"/>
-                      <a:ext cx="2447726" cy="1872880"/>
+                      <a:ext cx="2563087" cy="1878242"/>
                     </a:xfrm>
                     <a:prstGeom prst="rect">
                       <a:avLst/>
@@ -3437,6 +3445,8 @@
           </wp:inline>
         </w:drawing>
       </w:r>
+      <w:bookmarkStart w:id="0" w:name="_GoBack"/>
+      <w:bookmarkEnd w:id="0"/>
     </w:p>
     <w:p>
       <w:pPr>
@@ -3866,6 +3876,7 @@
         <w:rPr>
           <w:rFonts w:ascii="Times New Roman" w:hAnsi="Times New Roman" w:cs="Times New Roman"/>
           <w:bCs/>
+          <w:noProof/>
           <w:sz w:val="24"/>
           <w:szCs w:val="24"/>
           <w:lang w:val="en-US"/>
@@ -4176,6 +4187,7 @@
         <w:rPr>
           <w:rFonts w:ascii="Times New Roman" w:hAnsi="Times New Roman" w:cs="Times New Roman"/>
           <w:bCs/>
+          <w:noProof/>
           <w:sz w:val="24"/>
           <w:szCs w:val="24"/>
           <w:lang w:val="en-US"/>
@@ -4351,6 +4363,7 @@
         <w:rPr>
           <w:rFonts w:ascii="Times New Roman" w:hAnsi="Times New Roman" w:cs="Times New Roman"/>
           <w:bCs/>
+          <w:noProof/>
           <w:sz w:val="24"/>
           <w:szCs w:val="24"/>
           <w:lang w:val="en-US"/>

</xml_diff>